<commit_message>
IEEE TR package: remove prior-version declaration, add all author e-mails
</commit_message>
<xml_diff>
--- a/download/Cover_Letter_IEEE_TR.docx
+++ b/download/Cover_Letter_IEEE_TR.docx
@@ -275,7 +275,7 @@
           <w:sz w:val="25"/>
           <w:szCs w:val="25"/>
         </w:rPr>
-        <w:t xml:space="preserve">Declaration of Prior Conference Publication</w:t>
+        <w:t xml:space="preserve">Originality and Integrity Statements</w:t>
       </w:r>
     </w:p>
     <w:p>
@@ -290,286 +290,7 @@
           <w:sz w:val="24"/>
           <w:szCs w:val="24"/>
         </w:rPr>
-        <w:t xml:space="preserve">In the spirit of full disclosure, and in accordance with IEEE policy on evolutionary submissions, we declare that this manuscript extends an earlier conference version of this work: 【complete citation — authors, title, conference name (IEEE WIECON-ECE), location, year, and DOI if available】.</w:t>
-      </w:r>
-    </w:p>
-    <w:p>
-      <w:pPr>
-        <w:spacing w:after="160" w:line="312"/>
-        <w:jc w:val="left"/>
-      </w:pPr>
-      <w:r>
-        <w:rPr>
-          <w:rFonts w:ascii="Times New Roman" w:eastAsia="Times New Roman"/>
-          <w:color w:val="000000"/>
-          <w:sz w:val="24"/>
-          <w:szCs w:val="24"/>
-        </w:rPr>
-        <w:t xml:space="preserve">The prior conference version presented an initial study of the multi-horizon failure-risk framework on the NASA and CALCE (LCO) datasets. The present journal submission substantially extends that work with the following new material:</w:t>
-      </w:r>
-    </w:p>
-    <w:p>
-      <w:pPr>
-        <w:pStyle w:val="ListParagraph"/>
-        <w:numPr>
-          <w:ilvl w:val="0"/>
-          <w:numId w:val="1"/>
-        </w:numPr>
-        <w:spacing w:after="100" w:line="312"/>
-        <w:jc w:val="left"/>
-      </w:pPr>
-      <w:r>
-        <w:rPr>
-          <w:rFonts w:ascii="Times New Roman" w:eastAsia="Times New Roman"/>
-          <w:b/>
-          <w:bCs/>
-          <w:color w:val="000000"/>
-          <w:sz w:val="24"/>
-          <w:szCs w:val="24"/>
-        </w:rPr>
-        <w:t xml:space="preserve">Cross-chemistry evaluation: </w:t>
-      </w:r>
-      <w:r>
-        <w:rPr>
-          <w:rFonts w:ascii="Times New Roman" w:eastAsia="Times New Roman"/>
-          <w:color w:val="000000"/>
-          <w:sz w:val="24"/>
-          <w:szCs w:val="24"/>
-        </w:rPr>
-        <w:t xml:space="preserve">eight public datasets across four chemistries (LCO, LFP, NCA, NMC) from six laboratories, replacing the original two-dataset, single-chemistry evaluation;</w:t>
-      </w:r>
-    </w:p>
-    <w:p>
-      <w:pPr>
-        <w:pStyle w:val="ListParagraph"/>
-        <w:numPr>
-          <w:ilvl w:val="0"/>
-          <w:numId w:val="1"/>
-        </w:numPr>
-        <w:spacing w:after="100" w:line="312"/>
-        <w:jc w:val="left"/>
-      </w:pPr>
-      <w:r>
-        <w:rPr>
-          <w:rFonts w:ascii="Times New Roman" w:eastAsia="Times New Roman"/>
-          <w:b/>
-          <w:bCs/>
-          <w:color w:val="000000"/>
-          <w:sz w:val="24"/>
-          <w:szCs w:val="24"/>
-        </w:rPr>
-        <w:t xml:space="preserve">Replication study: </w:t>
-      </w:r>
-      <w:r>
-        <w:rPr>
-          <w:rFonts w:ascii="Times New Roman" w:eastAsia="Times New Roman"/>
-          <w:color w:val="000000"/>
-          <w:sz w:val="24"/>
-          <w:szCs w:val="24"/>
-        </w:rPr>
-        <w:t xml:space="preserve">a pre-registered replication on 60 NMC, NCA, and LFP cells from two additional laboratories (HNEI and SNL via the Battery Archive);</w:t>
-      </w:r>
-    </w:p>
-    <w:p>
-      <w:pPr>
-        <w:pStyle w:val="ListParagraph"/>
-        <w:numPr>
-          <w:ilvl w:val="0"/>
-          <w:numId w:val="1"/>
-        </w:numPr>
-        <w:spacing w:after="100" w:line="312"/>
-        <w:jc w:val="left"/>
-      </w:pPr>
-      <w:r>
-        <w:rPr>
-          <w:rFonts w:ascii="Times New Roman" w:eastAsia="Times New Roman"/>
-          <w:b/>
-          <w:bCs/>
-          <w:color w:val="000000"/>
-          <w:sz w:val="24"/>
-          <w:szCs w:val="24"/>
-        </w:rPr>
-        <w:t xml:space="preserve">Discrete-time hazard model: </w:t>
-      </w:r>
-      <w:r>
-        <w:rPr>
-          <w:rFonts w:ascii="Times New Roman" w:eastAsia="Times New Roman"/>
-          <w:color w:val="000000"/>
-          <w:sz w:val="24"/>
-          <w:szCs w:val="24"/>
-        </w:rPr>
-        <w:t xml:space="preserve">a survival-product formulation that is monotone in the horizon, contrasted against independent fixed-horizon classifiers, with quantified monotonicity-violation rates;</w:t>
-      </w:r>
-    </w:p>
-    <w:p>
-      <w:pPr>
-        <w:pStyle w:val="ListParagraph"/>
-        <w:numPr>
-          <w:ilvl w:val="0"/>
-          <w:numId w:val="1"/>
-        </w:numPr>
-        <w:spacing w:after="100" w:line="312"/>
-        <w:jc w:val="left"/>
-      </w:pPr>
-      <w:r>
-        <w:rPr>
-          <w:rFonts w:ascii="Times New Roman" w:eastAsia="Times New Roman"/>
-          <w:b/>
-          <w:bCs/>
-          <w:color w:val="000000"/>
-          <w:sz w:val="24"/>
-          <w:szCs w:val="24"/>
-        </w:rPr>
-        <w:t xml:space="preserve">Validity controls: </w:t>
-      </w:r>
-      <w:r>
-        <w:rPr>
-          <w:rFonts w:ascii="Times New Roman" w:eastAsia="Times New Roman"/>
-          <w:color w:val="000000"/>
-          <w:sz w:val="24"/>
-          <w:szCs w:val="24"/>
-        </w:rPr>
-        <w:t xml:space="preserve">minimal health-state baselines, a factorial feature ablation, a failure-definition ablation separating SOH and voltage-sag endpoints, and same-chemistry cross-laboratory and operating-condition controls;</w:t>
-      </w:r>
-    </w:p>
-    <w:p>
-      <w:pPr>
-        <w:pStyle w:val="ListParagraph"/>
-        <w:numPr>
-          <w:ilvl w:val="0"/>
-          <w:numId w:val="1"/>
-        </w:numPr>
-        <w:spacing w:after="100" w:line="312"/>
-        <w:jc w:val="left"/>
-      </w:pPr>
-      <w:r>
-        <w:rPr>
-          <w:rFonts w:ascii="Times New Roman" w:eastAsia="Times New Roman"/>
-          <w:b/>
-          <w:bCs/>
-          <w:color w:val="000000"/>
-          <w:sz w:val="24"/>
-          <w:szCs w:val="24"/>
-        </w:rPr>
-        <w:t xml:space="preserve">Calibration under shift: </w:t>
-      </w:r>
-      <w:r>
-        <w:rPr>
-          <w:rFonts w:ascii="Times New Roman" w:eastAsia="Times New Roman"/>
-          <w:color w:val="000000"/>
-          <w:sz w:val="24"/>
-          <w:szCs w:val="24"/>
-        </w:rPr>
-        <w:t xml:space="preserve">a comparison of Platt scaling and isotonic regression under cross-dataset shift, with small-sample labeled-target recalibration;</w:t>
-      </w:r>
-    </w:p>
-    <w:p>
-      <w:pPr>
-        <w:pStyle w:val="ListParagraph"/>
-        <w:numPr>
-          <w:ilvl w:val="0"/>
-          <w:numId w:val="1"/>
-        </w:numPr>
-        <w:spacing w:after="100" w:line="312"/>
-        <w:jc w:val="left"/>
-      </w:pPr>
-      <w:r>
-        <w:rPr>
-          <w:rFonts w:ascii="Times New Roman" w:eastAsia="Times New Roman"/>
-          <w:b/>
-          <w:bCs/>
-          <w:color w:val="000000"/>
-          <w:sz w:val="24"/>
-          <w:szCs w:val="24"/>
-        </w:rPr>
-        <w:t xml:space="preserve">Operational evaluation: </w:t>
-      </w:r>
-      <w:r>
-        <w:rPr>
-          <w:rFonts w:ascii="Times New Roman" w:eastAsia="Times New Roman"/>
-          <w:color w:val="000000"/>
-          <w:sz w:val="24"/>
-          <w:szCs w:val="24"/>
-        </w:rPr>
-        <w:t xml:space="preserve">a cost-sensitive decision analysis and a complete embedded deployment on an ESP32-S3 microcontroller, including a C re-implementation validated against the training libraries;</w:t>
-      </w:r>
-    </w:p>
-    <w:p>
-      <w:pPr>
-        <w:pStyle w:val="ListParagraph"/>
-        <w:numPr>
-          <w:ilvl w:val="0"/>
-          <w:numId w:val="1"/>
-        </w:numPr>
-        <w:spacing w:after="100" w:line="312"/>
-        <w:jc w:val="left"/>
-      </w:pPr>
-      <w:r>
-        <w:rPr>
-          <w:rFonts w:ascii="Times New Roman" w:eastAsia="Times New Roman"/>
-          <w:b/>
-          <w:bCs/>
-          <w:color w:val="000000"/>
-          <w:sz w:val="24"/>
-          <w:szCs w:val="24"/>
-        </w:rPr>
-        <w:t xml:space="preserve">Uncertainty treatment: </w:t>
-      </w:r>
-      <w:r>
-        <w:rPr>
-          <w:rFonts w:ascii="Times New Roman" w:eastAsia="Times New Roman"/>
-          <w:color w:val="000000"/>
-          <w:sz w:val="24"/>
-          <w:szCs w:val="24"/>
-        </w:rPr>
-        <w:t xml:space="preserve">cell-level bootstrap intervals on every headline number, replacing cycle-level significance tests as primary evidence.</w:t>
-      </w:r>
-    </w:p>
-    <w:p>
-      <w:pPr>
-        <w:spacing w:after="160" w:line="312"/>
-        <w:jc w:val="left"/>
-      </w:pPr>
-      <w:r>
-        <w:rPr>
-          <w:rFonts w:ascii="Times New Roman" w:eastAsia="Times New Roman"/>
-          <w:color w:val="000000"/>
-          <w:sz w:val="24"/>
-          <w:szCs w:val="24"/>
-        </w:rPr>
-        <w:t xml:space="preserve">We estimate that this new material constitutes the majority of the technical content of the journal version. All overlapping text, figures, and results are or will be clearly attributed to the prior version by citation. 【Before submission, verify this enumeration of new material against the final camera-ready conference paper and adjust as needed.】</w:t>
-      </w:r>
-    </w:p>
-    <w:p>
-      <w:pPr>
-        <w:pStyle w:val="Heading2"/>
-        <w:spacing w:after="120" w:before="240" w:line="312"/>
-      </w:pPr>
-      <w:r>
-        <w:rPr>
-          <w:rFonts w:ascii="Times New Roman" w:eastAsia="Times New Roman"/>
-          <w:b/>
-          <w:bCs/>
-          <w:color w:val="000000"/>
-          <w:sz w:val="25"/>
-          <w:szCs w:val="25"/>
-        </w:rPr>
-        <w:t xml:space="preserve">Originality and Integrity Statements</w:t>
-      </w:r>
-    </w:p>
-    <w:p>
-      <w:pPr>
-        <w:spacing w:after="160" w:line="312"/>
-        <w:jc w:val="left"/>
-      </w:pPr>
-      <w:r>
-        <w:rPr>
-          <w:rFonts w:ascii="Times New Roman" w:eastAsia="Times New Roman"/>
-          <w:color w:val="000000"/>
-          <w:sz w:val="24"/>
-          <w:szCs w:val="24"/>
-        </w:rPr>
-        <w:t xml:space="preserve">We confirm that the manuscript is original, has not been published previously in any form other than the conference version declared above, and is not under consideration by any other journal or conference. All authors have read and approved the submitted version and meet the authorship criteria of the IEEE. All datasets used are publicly available and are properly cited. We have no conflicts of interest, financial or otherwise, to declare. No human or animal subjects were involved.</w:t>
+        <w:t xml:space="preserve">We confirm that the manuscript is original, has not been published previously in any form, and is not under consideration by any other journal or conference. All authors have read and approved the submitted version and meet the authorship criteria of the IEEE. All datasets used are publicly available and are properly cited. We have no conflicts of interest, financial or otherwise, to declare. No human or animal subjects were involved.</w:t>
       </w:r>
     </w:p>
     <w:p>

</xml_diff>